<commit_message>
Puntos del Art. 46 nuevo, fotos de la R1, hero más fluido y mensaje de marca
- Escala de puntos 25-20-16-13-11-10-9-8-7-6-5-4-3-2-1 y 1 punto por finalizar
  desde el 16.º, según el reglamento actualizado; test que vigila que la web y
  la tabla de /reglamento coincidan.
- Fotos de la R1 de la T2 (podio, grupo, parrilla, briefing y salida).
- Hero: 330/240 frames, fundido entre frames y seguimiento amortiguado del scroll.
- Se quita el "elitista / accesible" literal de los textos.

Co-Authored-By: Claude Opus 5.5 <noreply@anthropic.com>
</commit_message>
<xml_diff>
--- a/tools/reglamento/RUKC_Reglamento_Sprint_v1.1.docx
+++ b/tools/reglamento/RUKC_Reglamento_Sprint_v1.1.docx
@@ -1711,6 +1711,113 @@
                 <w:szCs w:val="18"/>
               </w:rPr>
               <w:t xml:space="preserve">Sanciones sin ambigüedad</w:t>
+            </w:r>
+          </w:p>
+        </w:tc>
+      </w:tr>
+      <w:tr>
+        <w:trPr>
+          <w:cantSplit w:val="1"/>
+        </w:trPr>
+        <w:tc>
+          <w:tcPr>
+            <w:tcW w:w="2100" w:type="dxa"/>
+            <w:tcBorders>
+              <w:top w:color="cccccc" w:space="0" w:sz="4" w:val="single"/>
+              <w:left w:color="cccccc" w:space="0" w:sz="4" w:val="single"/>
+              <w:bottom w:color="cccccc" w:space="0" w:sz="4" w:val="single"/>
+              <w:right w:color="cccccc" w:space="0" w:sz="4" w:val="single"/>
+            </w:tcBorders>
+            <w:tcMar>
+              <w:top w:w="60" w:type="dxa"/>
+              <w:left w:w="110" w:type="dxa"/>
+              <w:bottom w:w="60" w:type="dxa"/>
+              <w:right w:w="110" w:type="dxa"/>
+            </w:tcMar>
+            <w:vAlign w:val="center"/>
+          </w:tcPr>
+          <w:p>
+            <w:pPr>
+              <w:spacing w:after="0" w:before="0" w:lineRule="auto"/>
+              <w:jc w:val="left"/>
+              <w:rPr/>
+            </w:pPr>
+            <w:r>
+              <w:rPr>
+                <w:rFonts w:ascii="Arial" w:cs="Arial" w:eastAsia="Arial" w:hAnsi="Arial"/>
+                <w:color w:val="111111"/>
+                <w:sz w:val="18"/>
+                <w:szCs w:val="18"/>
+              </w:rPr>
+              <w:t xml:space="preserve">46</w:t>
+            </w:r>
+          </w:p>
+        </w:tc>
+        <w:tc>
+          <w:tcPr>
+            <w:tcW w:w="4426" w:type="dxa"/>
+            <w:tcBorders>
+              <w:top w:color="cccccc" w:space="0" w:sz="4" w:val="single"/>
+              <w:left w:color="cccccc" w:space="0" w:sz="4" w:val="single"/>
+              <w:bottom w:color="cccccc" w:space="0" w:sz="4" w:val="single"/>
+              <w:right w:color="cccccc" w:space="0" w:sz="4" w:val="single"/>
+            </w:tcBorders>
+            <w:tcMar>
+              <w:top w:w="60" w:type="dxa"/>
+              <w:left w:w="110" w:type="dxa"/>
+              <w:bottom w:w="60" w:type="dxa"/>
+              <w:right w:w="110" w:type="dxa"/>
+            </w:tcMar>
+            <w:vAlign w:val="center"/>
+          </w:tcPr>
+          <w:p>
+            <w:pPr>
+              <w:spacing w:after="0" w:before="0" w:lineRule="auto"/>
+              <w:jc w:val="left"/>
+              <w:rPr/>
+            </w:pPr>
+            <w:r>
+              <w:rPr>
+                <w:rFonts w:ascii="Arial" w:cs="Arial" w:eastAsia="Arial" w:hAnsi="Arial"/>
+                <w:color w:val="111111"/>
+                <w:sz w:val="18"/>
+                <w:szCs w:val="18"/>
+              </w:rPr>
+              <w:t xml:space="preserve">Nueva escala de puntos: del 1.º (25) al 15.º (1); desde el 16.º, 1 punto por finalizar.</w:t>
+            </w:r>
+          </w:p>
+        </w:tc>
+        <w:tc>
+          <w:tcPr>
+            <w:tcW w:w="2500" w:type="dxa"/>
+            <w:tcBorders>
+              <w:top w:color="cccccc" w:space="0" w:sz="4" w:val="single"/>
+              <w:left w:color="cccccc" w:space="0" w:sz="4" w:val="single"/>
+              <w:bottom w:color="cccccc" w:space="0" w:sz="4" w:val="single"/>
+              <w:right w:color="cccccc" w:space="0" w:sz="4" w:val="single"/>
+            </w:tcBorders>
+            <w:tcMar>
+              <w:top w:w="60" w:type="dxa"/>
+              <w:left w:w="110" w:type="dxa"/>
+              <w:bottom w:w="60" w:type="dxa"/>
+              <w:right w:w="110" w:type="dxa"/>
+            </w:tcMar>
+            <w:vAlign w:val="center"/>
+          </w:tcPr>
+          <w:p>
+            <w:pPr>
+              <w:spacing w:after="0" w:before="0" w:lineRule="auto"/>
+              <w:jc w:val="left"/>
+              <w:rPr/>
+            </w:pPr>
+            <w:r>
+              <w:rPr>
+                <w:rFonts w:ascii="Arial" w:cs="Arial" w:eastAsia="Arial" w:hAnsi="Arial"/>
+                <w:color w:val="111111"/>
+                <w:sz w:val="18"/>
+                <w:szCs w:val="18"/>
+              </w:rPr>
+              <w:t xml:space="preserve">Premiar a más posiciones de la parrilla</w:t>
             </w:r>
           </w:p>
         </w:tc>
@@ -2904,7 +3011,7 @@
             <w:rPr>
               <w:rFonts w:ascii="Arial" w:cs="Arial" w:eastAsia="Arial" w:hAnsi="Arial"/>
             </w:rPr>
-            <w:t xml:space="preserve">20</w:t>
+            <w:t xml:space="preserve">21</w:t>
           </w:r>
         </w:p>
         <w:p>
@@ -15398,7 +15505,7 @@
         <w:rPr>
           <w:rFonts w:ascii="Arial" w:cs="Arial" w:eastAsia="Arial" w:hAnsi="Arial"/>
         </w:rPr>
-        <w:t xml:space="preserve">Se otorgan según la posición final:</w:t>
+        <w:t xml:space="preserve">Se otorgan según la posición final, solo a los pilotos que finalizan la carrera (Art. 46 bis b):</w:t>
       </w:r>
     </w:p>
     <w:p>
@@ -15648,7 +15755,7 @@
                 <w:sz w:val="18"/>
                 <w:szCs w:val="18"/>
               </w:rPr>
-              <w:t xml:space="preserve">18 puntos</w:t>
+              <w:t xml:space="preserve">20 puntos</w:t>
             </w:r>
           </w:p>
         </w:tc>
@@ -15721,7 +15828,7 @@
                 <w:sz w:val="18"/>
                 <w:szCs w:val="18"/>
               </w:rPr>
-              <w:t xml:space="preserve">15 puntos</w:t>
+              <w:t xml:space="preserve">16 puntos</w:t>
             </w:r>
           </w:p>
         </w:tc>
@@ -15794,7 +15901,7 @@
                 <w:sz w:val="18"/>
                 <w:szCs w:val="18"/>
               </w:rPr>
-              <w:t xml:space="preserve">12 puntos</w:t>
+              <w:t xml:space="preserve">13 puntos</w:t>
             </w:r>
           </w:p>
         </w:tc>
@@ -15867,7 +15974,7 @@
                 <w:sz w:val="18"/>
                 <w:szCs w:val="18"/>
               </w:rPr>
-              <w:t xml:space="preserve">10 puntos</w:t>
+              <w:t xml:space="preserve">11 puntos</w:t>
             </w:r>
           </w:p>
         </w:tc>
@@ -15940,7 +16047,7 @@
                 <w:sz w:val="18"/>
                 <w:szCs w:val="18"/>
               </w:rPr>
-              <w:t xml:space="preserve">8 puntos</w:t>
+              <w:t xml:space="preserve">10 puntos</w:t>
             </w:r>
           </w:p>
         </w:tc>
@@ -16013,7 +16120,7 @@
                 <w:sz w:val="18"/>
                 <w:szCs w:val="18"/>
               </w:rPr>
-              <w:t xml:space="preserve">6 puntos</w:t>
+              <w:t xml:space="preserve">9 puntos</w:t>
             </w:r>
           </w:p>
         </w:tc>
@@ -16086,7 +16193,7 @@
                 <w:sz w:val="18"/>
                 <w:szCs w:val="18"/>
               </w:rPr>
-              <w:t xml:space="preserve">4 puntos</w:t>
+              <w:t xml:space="preserve">8 puntos</w:t>
             </w:r>
           </w:p>
         </w:tc>
@@ -16159,7 +16266,7 @@
                 <w:sz w:val="18"/>
                 <w:szCs w:val="18"/>
               </w:rPr>
-              <w:t xml:space="preserve">2 puntos</w:t>
+              <w:t xml:space="preserve">7 puntos</w:t>
             </w:r>
           </w:p>
         </w:tc>
@@ -16232,7 +16339,7 @@
                 <w:sz w:val="18"/>
                 <w:szCs w:val="18"/>
               </w:rPr>
-              <w:t xml:space="preserve">1 punto</w:t>
+              <w:t xml:space="preserve">6 puntos</w:t>
             </w:r>
           </w:p>
         </w:tc>
@@ -16271,7 +16378,372 @@
                 <w:sz w:val="18"/>
                 <w:szCs w:val="18"/>
               </w:rPr>
-              <w:t xml:space="preserve">11.º en adelante</w:t>
+              <w:t xml:space="preserve">11.º</w:t>
+            </w:r>
+          </w:p>
+        </w:tc>
+        <w:tc>
+          <w:tcPr>
+            <w:tcW w:w="4513" w:type="dxa"/>
+            <w:tcBorders>
+              <w:top w:color="cccccc" w:space="0" w:sz="4" w:val="single"/>
+              <w:left w:color="cccccc" w:space="0" w:sz="4" w:val="single"/>
+              <w:bottom w:color="cccccc" w:space="0" w:sz="4" w:val="single"/>
+              <w:right w:color="cccccc" w:space="0" w:sz="4" w:val="single"/>
+            </w:tcBorders>
+            <w:tcMar>
+              <w:top w:w="60" w:type="dxa"/>
+              <w:left w:w="110" w:type="dxa"/>
+              <w:bottom w:w="60" w:type="dxa"/>
+              <w:right w:w="110" w:type="dxa"/>
+            </w:tcMar>
+            <w:vAlign w:val="center"/>
+          </w:tcPr>
+          <w:p>
+            <w:pPr>
+              <w:spacing w:after="0" w:before="0" w:lineRule="auto"/>
+              <w:jc w:val="left"/>
+              <w:rPr/>
+            </w:pPr>
+            <w:r>
+              <w:rPr>
+                <w:rFonts w:ascii="Arial" w:cs="Arial" w:eastAsia="Arial" w:hAnsi="Arial"/>
+                <w:color w:val="111111"/>
+                <w:sz w:val="18"/>
+                <w:szCs w:val="18"/>
+              </w:rPr>
+              <w:t xml:space="preserve">5 puntos</w:t>
+            </w:r>
+          </w:p>
+        </w:tc>
+      </w:tr>
+      <w:tr>
+        <w:trPr>
+          <w:cantSplit w:val="1"/>
+        </w:trPr>
+        <w:tc>
+          <w:tcPr>
+            <w:tcW w:w="4513" w:type="dxa"/>
+            <w:tcBorders>
+              <w:top w:color="cccccc" w:space="0" w:sz="4" w:val="single"/>
+              <w:left w:color="cccccc" w:space="0" w:sz="4" w:val="single"/>
+              <w:bottom w:color="cccccc" w:space="0" w:sz="4" w:val="single"/>
+              <w:right w:color="cccccc" w:space="0" w:sz="4" w:val="single"/>
+            </w:tcBorders>
+            <w:tcMar>
+              <w:top w:w="60" w:type="dxa"/>
+              <w:left w:w="110" w:type="dxa"/>
+              <w:bottom w:w="60" w:type="dxa"/>
+              <w:right w:w="110" w:type="dxa"/>
+            </w:tcMar>
+            <w:vAlign w:val="center"/>
+          </w:tcPr>
+          <w:p>
+            <w:pPr>
+              <w:spacing w:after="0" w:before="0" w:lineRule="auto"/>
+              <w:jc w:val="left"/>
+              <w:rPr/>
+            </w:pPr>
+            <w:r>
+              <w:rPr>
+                <w:rFonts w:ascii="Arial" w:cs="Arial" w:eastAsia="Arial" w:hAnsi="Arial"/>
+                <w:color w:val="111111"/>
+                <w:sz w:val="18"/>
+                <w:szCs w:val="18"/>
+              </w:rPr>
+              <w:t xml:space="preserve">12.º</w:t>
+            </w:r>
+          </w:p>
+        </w:tc>
+        <w:tc>
+          <w:tcPr>
+            <w:tcW w:w="4513" w:type="dxa"/>
+            <w:tcBorders>
+              <w:top w:color="cccccc" w:space="0" w:sz="4" w:val="single"/>
+              <w:left w:color="cccccc" w:space="0" w:sz="4" w:val="single"/>
+              <w:bottom w:color="cccccc" w:space="0" w:sz="4" w:val="single"/>
+              <w:right w:color="cccccc" w:space="0" w:sz="4" w:val="single"/>
+            </w:tcBorders>
+            <w:tcMar>
+              <w:top w:w="60" w:type="dxa"/>
+              <w:left w:w="110" w:type="dxa"/>
+              <w:bottom w:w="60" w:type="dxa"/>
+              <w:right w:w="110" w:type="dxa"/>
+            </w:tcMar>
+            <w:vAlign w:val="center"/>
+          </w:tcPr>
+          <w:p>
+            <w:pPr>
+              <w:spacing w:after="0" w:before="0" w:lineRule="auto"/>
+              <w:jc w:val="left"/>
+              <w:rPr/>
+            </w:pPr>
+            <w:r>
+              <w:rPr>
+                <w:rFonts w:ascii="Arial" w:cs="Arial" w:eastAsia="Arial" w:hAnsi="Arial"/>
+                <w:color w:val="111111"/>
+                <w:sz w:val="18"/>
+                <w:szCs w:val="18"/>
+              </w:rPr>
+              <w:t xml:space="preserve">4 puntos</w:t>
+            </w:r>
+          </w:p>
+        </w:tc>
+      </w:tr>
+      <w:tr>
+        <w:trPr>
+          <w:cantSplit w:val="1"/>
+        </w:trPr>
+        <w:tc>
+          <w:tcPr>
+            <w:tcW w:w="4513" w:type="dxa"/>
+            <w:tcBorders>
+              <w:top w:color="cccccc" w:space="0" w:sz="4" w:val="single"/>
+              <w:left w:color="cccccc" w:space="0" w:sz="4" w:val="single"/>
+              <w:bottom w:color="cccccc" w:space="0" w:sz="4" w:val="single"/>
+              <w:right w:color="cccccc" w:space="0" w:sz="4" w:val="single"/>
+            </w:tcBorders>
+            <w:tcMar>
+              <w:top w:w="60" w:type="dxa"/>
+              <w:left w:w="110" w:type="dxa"/>
+              <w:bottom w:w="60" w:type="dxa"/>
+              <w:right w:w="110" w:type="dxa"/>
+            </w:tcMar>
+            <w:vAlign w:val="center"/>
+          </w:tcPr>
+          <w:p>
+            <w:pPr>
+              <w:spacing w:after="0" w:before="0" w:lineRule="auto"/>
+              <w:jc w:val="left"/>
+              <w:rPr/>
+            </w:pPr>
+            <w:r>
+              <w:rPr>
+                <w:rFonts w:ascii="Arial" w:cs="Arial" w:eastAsia="Arial" w:hAnsi="Arial"/>
+                <w:color w:val="111111"/>
+                <w:sz w:val="18"/>
+                <w:szCs w:val="18"/>
+              </w:rPr>
+              <w:t xml:space="preserve">13.º</w:t>
+            </w:r>
+          </w:p>
+        </w:tc>
+        <w:tc>
+          <w:tcPr>
+            <w:tcW w:w="4513" w:type="dxa"/>
+            <w:tcBorders>
+              <w:top w:color="cccccc" w:space="0" w:sz="4" w:val="single"/>
+              <w:left w:color="cccccc" w:space="0" w:sz="4" w:val="single"/>
+              <w:bottom w:color="cccccc" w:space="0" w:sz="4" w:val="single"/>
+              <w:right w:color="cccccc" w:space="0" w:sz="4" w:val="single"/>
+            </w:tcBorders>
+            <w:tcMar>
+              <w:top w:w="60" w:type="dxa"/>
+              <w:left w:w="110" w:type="dxa"/>
+              <w:bottom w:w="60" w:type="dxa"/>
+              <w:right w:w="110" w:type="dxa"/>
+            </w:tcMar>
+            <w:vAlign w:val="center"/>
+          </w:tcPr>
+          <w:p>
+            <w:pPr>
+              <w:spacing w:after="0" w:before="0" w:lineRule="auto"/>
+              <w:jc w:val="left"/>
+              <w:rPr/>
+            </w:pPr>
+            <w:r>
+              <w:rPr>
+                <w:rFonts w:ascii="Arial" w:cs="Arial" w:eastAsia="Arial" w:hAnsi="Arial"/>
+                <w:color w:val="111111"/>
+                <w:sz w:val="18"/>
+                <w:szCs w:val="18"/>
+              </w:rPr>
+              <w:t xml:space="preserve">3 puntos</w:t>
+            </w:r>
+          </w:p>
+        </w:tc>
+      </w:tr>
+      <w:tr>
+        <w:trPr>
+          <w:cantSplit w:val="1"/>
+        </w:trPr>
+        <w:tc>
+          <w:tcPr>
+            <w:tcW w:w="4513" w:type="dxa"/>
+            <w:tcBorders>
+              <w:top w:color="cccccc" w:space="0" w:sz="4" w:val="single"/>
+              <w:left w:color="cccccc" w:space="0" w:sz="4" w:val="single"/>
+              <w:bottom w:color="cccccc" w:space="0" w:sz="4" w:val="single"/>
+              <w:right w:color="cccccc" w:space="0" w:sz="4" w:val="single"/>
+            </w:tcBorders>
+            <w:tcMar>
+              <w:top w:w="60" w:type="dxa"/>
+              <w:left w:w="110" w:type="dxa"/>
+              <w:bottom w:w="60" w:type="dxa"/>
+              <w:right w:w="110" w:type="dxa"/>
+            </w:tcMar>
+            <w:vAlign w:val="center"/>
+          </w:tcPr>
+          <w:p>
+            <w:pPr>
+              <w:spacing w:after="0" w:before="0" w:lineRule="auto"/>
+              <w:jc w:val="left"/>
+              <w:rPr/>
+            </w:pPr>
+            <w:r>
+              <w:rPr>
+                <w:rFonts w:ascii="Arial" w:cs="Arial" w:eastAsia="Arial" w:hAnsi="Arial"/>
+                <w:color w:val="111111"/>
+                <w:sz w:val="18"/>
+                <w:szCs w:val="18"/>
+              </w:rPr>
+              <w:t xml:space="preserve">14.º</w:t>
+            </w:r>
+          </w:p>
+        </w:tc>
+        <w:tc>
+          <w:tcPr>
+            <w:tcW w:w="4513" w:type="dxa"/>
+            <w:tcBorders>
+              <w:top w:color="cccccc" w:space="0" w:sz="4" w:val="single"/>
+              <w:left w:color="cccccc" w:space="0" w:sz="4" w:val="single"/>
+              <w:bottom w:color="cccccc" w:space="0" w:sz="4" w:val="single"/>
+              <w:right w:color="cccccc" w:space="0" w:sz="4" w:val="single"/>
+            </w:tcBorders>
+            <w:tcMar>
+              <w:top w:w="60" w:type="dxa"/>
+              <w:left w:w="110" w:type="dxa"/>
+              <w:bottom w:w="60" w:type="dxa"/>
+              <w:right w:w="110" w:type="dxa"/>
+            </w:tcMar>
+            <w:vAlign w:val="center"/>
+          </w:tcPr>
+          <w:p>
+            <w:pPr>
+              <w:spacing w:after="0" w:before="0" w:lineRule="auto"/>
+              <w:jc w:val="left"/>
+              <w:rPr/>
+            </w:pPr>
+            <w:r>
+              <w:rPr>
+                <w:rFonts w:ascii="Arial" w:cs="Arial" w:eastAsia="Arial" w:hAnsi="Arial"/>
+                <w:color w:val="111111"/>
+                <w:sz w:val="18"/>
+                <w:szCs w:val="18"/>
+              </w:rPr>
+              <w:t xml:space="preserve">2 puntos</w:t>
+            </w:r>
+          </w:p>
+        </w:tc>
+      </w:tr>
+      <w:tr>
+        <w:trPr>
+          <w:cantSplit w:val="1"/>
+        </w:trPr>
+        <w:tc>
+          <w:tcPr>
+            <w:tcW w:w="4513" w:type="dxa"/>
+            <w:tcBorders>
+              <w:top w:color="cccccc" w:space="0" w:sz="4" w:val="single"/>
+              <w:left w:color="cccccc" w:space="0" w:sz="4" w:val="single"/>
+              <w:bottom w:color="cccccc" w:space="0" w:sz="4" w:val="single"/>
+              <w:right w:color="cccccc" w:space="0" w:sz="4" w:val="single"/>
+            </w:tcBorders>
+            <w:tcMar>
+              <w:top w:w="60" w:type="dxa"/>
+              <w:left w:w="110" w:type="dxa"/>
+              <w:bottom w:w="60" w:type="dxa"/>
+              <w:right w:w="110" w:type="dxa"/>
+            </w:tcMar>
+            <w:vAlign w:val="center"/>
+          </w:tcPr>
+          <w:p>
+            <w:pPr>
+              <w:spacing w:after="0" w:before="0" w:lineRule="auto"/>
+              <w:jc w:val="left"/>
+              <w:rPr/>
+            </w:pPr>
+            <w:r>
+              <w:rPr>
+                <w:rFonts w:ascii="Arial" w:cs="Arial" w:eastAsia="Arial" w:hAnsi="Arial"/>
+                <w:color w:val="111111"/>
+                <w:sz w:val="18"/>
+                <w:szCs w:val="18"/>
+              </w:rPr>
+              <w:t xml:space="preserve">15.º</w:t>
+            </w:r>
+          </w:p>
+        </w:tc>
+        <w:tc>
+          <w:tcPr>
+            <w:tcW w:w="4513" w:type="dxa"/>
+            <w:tcBorders>
+              <w:top w:color="cccccc" w:space="0" w:sz="4" w:val="single"/>
+              <w:left w:color="cccccc" w:space="0" w:sz="4" w:val="single"/>
+              <w:bottom w:color="cccccc" w:space="0" w:sz="4" w:val="single"/>
+              <w:right w:color="cccccc" w:space="0" w:sz="4" w:val="single"/>
+            </w:tcBorders>
+            <w:tcMar>
+              <w:top w:w="60" w:type="dxa"/>
+              <w:left w:w="110" w:type="dxa"/>
+              <w:bottom w:w="60" w:type="dxa"/>
+              <w:right w:w="110" w:type="dxa"/>
+            </w:tcMar>
+            <w:vAlign w:val="center"/>
+          </w:tcPr>
+          <w:p>
+            <w:pPr>
+              <w:spacing w:after="0" w:before="0" w:lineRule="auto"/>
+              <w:jc w:val="left"/>
+              <w:rPr/>
+            </w:pPr>
+            <w:r>
+              <w:rPr>
+                <w:rFonts w:ascii="Arial" w:cs="Arial" w:eastAsia="Arial" w:hAnsi="Arial"/>
+                <w:color w:val="111111"/>
+                <w:sz w:val="18"/>
+                <w:szCs w:val="18"/>
+              </w:rPr>
+              <w:t xml:space="preserve">1 punto</w:t>
+            </w:r>
+          </w:p>
+        </w:tc>
+      </w:tr>
+      <w:tr>
+        <w:trPr>
+          <w:cantSplit w:val="1"/>
+        </w:trPr>
+        <w:tc>
+          <w:tcPr>
+            <w:tcW w:w="4513" w:type="dxa"/>
+            <w:tcBorders>
+              <w:top w:color="cccccc" w:space="0" w:sz="4" w:val="single"/>
+              <w:left w:color="cccccc" w:space="0" w:sz="4" w:val="single"/>
+              <w:bottom w:color="cccccc" w:space="0" w:sz="4" w:val="single"/>
+              <w:right w:color="cccccc" w:space="0" w:sz="4" w:val="single"/>
+            </w:tcBorders>
+            <w:tcMar>
+              <w:top w:w="60" w:type="dxa"/>
+              <w:left w:w="110" w:type="dxa"/>
+              <w:bottom w:w="60" w:type="dxa"/>
+              <w:right w:w="110" w:type="dxa"/>
+            </w:tcMar>
+            <w:vAlign w:val="center"/>
+          </w:tcPr>
+          <w:p>
+            <w:pPr>
+              <w:spacing w:after="0" w:before="0" w:lineRule="auto"/>
+              <w:jc w:val="left"/>
+              <w:rPr/>
+            </w:pPr>
+            <w:r>
+              <w:rPr>
+                <w:rFonts w:ascii="Arial" w:cs="Arial" w:eastAsia="Arial" w:hAnsi="Arial"/>
+                <w:color w:val="111111"/>
+                <w:sz w:val="18"/>
+                <w:szCs w:val="18"/>
+              </w:rPr>
+              <w:t xml:space="preserve">16.º en adelante</w:t>
             </w:r>
           </w:p>
         </w:tc>
@@ -19682,7 +20154,7 @@
         <w:rPr>
           <w:rFonts w:ascii="Arial" w:cs="Arial" w:eastAsia="Arial" w:hAnsi="Arial"/>
         </w:rPr>
-        <w:t xml:space="preserve">Para el campeonato por categoría, si la Ronda 1 se disputó con clasificación única, cada piloto recibe los puntos de su posición relativa entre los pilotos de su misma categoría, según el orden de llegada. La categoría se fija con el pesaje de la Ronda 1 o, si no lo hubo, con el primer pesaje del piloto.</w:t>
+        <w:t xml:space="preserve">Para el campeonato por categoría, si la Ronda 1 se disputó con clasificación única, cada piloto recibe los puntos de su posición relativa entre los pilotos de su misma categoría, según el orden de llegada y con la escala del Art. 46 de esta versión. La categoría se fija con el pesaje de la Ronda 1 o, si no lo hubo, con el primer pesaje del piloto.</w:t>
       </w:r>
     </w:p>
     <w:p>

</xml_diff>